<commit_message>
[Doc]: Bỏ phiên bản tài liệu, kho và cuộc họp chỉ giữ tham chiếu file (ADR-0018)
- ADR-0018: không có phiên bản; StoredFile bất biến, kho cá nhân và cuộc họp chỉ tham chiếu; job dọn file mồ côi; PDF/DOCX xem trước trên trình duyệt, server không chuyển đổi; thư mục kho như AI-eCabinet.
- UC: bỏ UC-32b, UC-33b; thêm UC-33c Gỡ tài liệu khỏi cuộc họp (chặn khi đã có biên bản), UC-71 Quản lý tài liệu cá nhân (71a–c), UC-72 Quản lý thư mục kho (72a–d). Chỉ Chủ toạ và Thư ký thêm/gỡ tài liệu cuộc họp.
- FE-11: Chủ toạ chọn vai trò được bỏ phiếu cho từng phiếu; xoá được phiếu nháp; Khách mời bỏ phiếu khi được chọn.
- BR-183 → BR-192; ERD thêm Folder, VotingSession.EligibleRoles; cập nhật ERD đích, ERD Chen, class diagram FE-05, use case diagram, wireframe.
- Report 1/2/3: sửa DOCX rồi đồng bộ Markdown bằng scripts/sync_reports.py.
</commit_message>
<xml_diff>
--- a/docs/08-reports/source/Report_1_Project_Introduction.docx
+++ b/docs/08-reports/source/Report_1_Project_Introduction.docx
@@ -2330,6 +2330,60 @@
           </w:p>
         </w:tc>
       </w:tr>
+      <w:tr>
+        <w:tc>
+          <w:tcPr>
+            <w:tcW w:w="1650" w:type="dxa"/>
+          </w:tcPr>
+          <w:p>
+            <w:pPr>
+              <w:pStyle w:val="normal1"/>
+            </w:pPr>
+            <w:r>
+              <w:t>13/10/2026</w:t>
+            </w:r>
+          </w:p>
+        </w:tc>
+        <w:tc>
+          <w:tcPr>
+            <w:tcW w:w="735" w:type="dxa"/>
+          </w:tcPr>
+          <w:p>
+            <w:pPr>
+              <w:pStyle w:val="normal1"/>
+            </w:pPr>
+            <w:r>
+              <w:t>M</w:t>
+            </w:r>
+          </w:p>
+        </w:tc>
+        <w:tc>
+          <w:tcPr>
+            <w:tcW w:w="1155" w:type="dxa"/>
+          </w:tcPr>
+          <w:p>
+            <w:pPr>
+              <w:pStyle w:val="normal1"/>
+            </w:pPr>
+            <w:r>
+              <w:t>HaiTV</w:t>
+            </w:r>
+          </w:p>
+        </w:tc>
+        <w:tc>
+          <w:tcPr>
+            <w:tcW w:w="6405" w:type="dxa"/>
+          </w:tcPr>
+          <w:p>
+            <w:pPr>
+              <w:pStyle w:val="normal1"/>
+            </w:pPr>
+            <w:r>
+              <w:t>FE-07: documents are not versioned; library and meetings reference one immutable file; Chair and Secretary add or remove meeting documents; library folders; browser-side preview (ADR-0018). FE-11: the Chair selects eligible voter roles; verified Guests vote; ending the Meeting does not require closing Votes (ADR-0016, ADR-0017).</w:t>
+            </w:r>
+          </w:p>
+        </w:tc>
+      </w:tr>
     </w:tbl>
     <w:p>
       <w:pPr>
@@ -5960,7 +6014,7 @@
               <w:pStyle w:val="normal1"/>
             </w:pPr>
             <w:r>
-              <w:t>Each internal user has a personal document library where documents can be uploaded and reused. Meeting Organizers and Secretaries can add a document to a meeting either by uploading a file from their computer or by selecting an existing document from their personal library. Meeting documents are versioned, previewed in the browser, searchable and kept with the meeting record. A meeting retains the exact document version selected when it was attached; later changes in the personal library do not silently replace the meeting version. Authorized users may comment on meeting documents.</w:t>
+              <w:t>Each internal user has a personal document library where PDF and DOCX documents can be uploaded, organised into folders (as in AI-eCabinet), renamed, moved, reused and deleted. The Chair and the Secretary of a meeting can add a document to it either by uploading a file from their computer or by selecting an existing document from their personal library, and can remove it until the meeting has minutes. Documents are not versioned or copied: the library and the meeting each keep a reference to the same immutable file, so deleting a document from the library does not affect a meeting that uses it, and files no longer referenced are cleaned up automatically. Meeting documents are previewed in the browser without any server-side conversion (download is blocked for Secret meetings), searchable and kept with the meeting record. Meeting participants, including verified Guests, may comment on meeting documents.</w:t>
             </w:r>
           </w:p>
         </w:tc>
@@ -6213,7 +6267,7 @@
               <w:jc w:val="both"/>
             </w:pPr>
             <w:r>
-              <w:t>The Chair creates, configures, opens and closes Votes only while the Meeting is InProgress. A Vote belongs directly to one Meeting and does not require an Agenda Item. Current eligible internal Chair, Secretary and Participant members may submit one ballot; Guests cannot vote, and submitted ballots cannot be changed or withdrawn. Public and secret ballots are supported. After closing and tallying, the Chair records Passed, NotPassed or Deferred on that Vote. There is no time-boxed voting, deadline, quorum or separate Resolution object. All Open Votes must be closed before the Meeting ends; tallies and Chair conclusions are included in its minutes.</w:t>
+              <w:t>The Chair creates, configures, opens and closes Votes only while the Meeting is InProgress. A Vote belongs directly to one Meeting and does not require an Agenda Item. For each Vote the Chair selects which meeting roles may vote (Chair, Secretary, Participant, verified Guest); each eligible person may submit one ballot while the Meeting is InProgress; submitted ballots cannot be changed or withdrawn. Public and secret ballots are supported. After closing and tallying, the Chair records Passed, NotPassed or Deferred on that Vote. There is no time-boxed voting, deadline, quorum or separate Resolution object. Ending the Meeting does not require closing Votes: no ballot is accepted after it ends, and the Chair may still close an Open Vote and record its conclusion. Tallies and Chair conclusions are included in its minutes.</w:t>
             </w:r>
           </w:p>
         </w:tc>

</xml_diff>